<commit_message>
vault backup: 2026-04-21 13:32:52
</commit_message>
<xml_diff>
--- a/dev/10 Projects/AZT/07_output/agency/AZT — Правки к плану MaximusMedia (финальная версия после полной сверки семядра) 2026-04-21.docx
+++ b/dev/10 Projects/AZT/07_output/agency/AZT — Правки к плану MaximusMedia (финальная версия после полной сверки семядра) 2026-04-21.docx
@@ -1743,7 +1743,7 @@
         <w:t xml:space="preserve"> </w:t>
       </w:r>
       <w:r>
-        <w:t xml:space="preserve">история другая — по фиксированным словоформам запросов почти нет, весь кажущийся пропущенный объём идёт через похожие формулировки, и Директ его всё равно подхватит через соседние ключи.</w:t>
+        <w:t xml:space="preserve">история другая — по фиксированным словоформам запросов почти нет, весь кажущийся пропущенный объём идёт через похожие формулировки. Покрываются ли они соседними ключами в Директе, нужно проверять по фактической структуре кампаний, групп и минус-фраз.</w:t>
       </w:r>
     </w:p>
     <w:p>
@@ -2641,7 +2641,7 @@
         <w:t xml:space="preserve">!</w:t>
       </w:r>
       <w:r>
-        <w:t xml:space="preserve">-частотность равны нулю, то есть реального спроса по ним нет ни в каком виде. В исходном семядре при этом стоят значения 5–35. Оставшиеся 15 фраз показывают</w:t>
+        <w:t xml:space="preserve">-частотность равны нулю, то есть прямого Wordstat-спроса по ним не видно. В исходном семядре при этом стоят значения 5–35. Оставшиеся 15 фраз показывают</w:t>
       </w:r>
       <w:r>
         <w:t xml:space="preserve"> </w:t>
@@ -2653,7 +2653,7 @@
         <w:t xml:space="preserve">!</w:t>
       </w:r>
       <w:r>
-        <w:t xml:space="preserve">-частотность 1–50 — для активной рекламы тоже не годится. В нынешнем виде кластер в Директе работать не будет.</w:t>
+        <w:t xml:space="preserve">-частотность 1–50 — для активной поисковой рекламы это слабая основа. В нынешнем виде кластер можно оставлять только как отдельную низкобюджетную/товарную гипотезу, но не как значимый блок performance-семантики.</w:t>
       </w:r>
     </w:p>
     <w:bookmarkEnd w:id="21"/>
@@ -3109,7 +3109,22 @@
         <w:t xml:space="preserve"> </w:t>
       </w:r>
       <w:r>
-        <w:t xml:space="preserve">и десятки других), по которым в Директе ставки окажутся систематически заниженными.</w:t>
+        <w:t xml:space="preserve">и десятки других). Если</w:t>
+      </w:r>
+      <w:r>
+        <w:t xml:space="preserve"> </w:t>
+      </w:r>
+      <w:r>
+        <w:rPr>
+          <w:rStyle w:val="VerbatimChar"/>
+        </w:rPr>
+        <w:t xml:space="preserve">!W</w:t>
+      </w:r>
+      <w:r>
+        <w:t xml:space="preserve"> </w:t>
+      </w:r>
+      <w:r>
+        <w:t xml:space="preserve">использовалась для отбора фраз, расчёта ставок или медиаплана, такие решения будут систематически искажены.</w:t>
       </w:r>
     </w:p>
     <w:p>
@@ -3304,7 +3319,7 @@
         <w:pStyle w:val="Compact"/>
       </w:pPr>
       <w:r>
-        <w:t xml:space="preserve">СПК #381–417 — 22 из 37 фраз с Wordstat = 0, в Директе они работать не будут.</w:t>
+        <w:t xml:space="preserve">СПК #381–417 — 22 из 37 фраз с Wordstat = 0; кластер требует отдельной проверки товарной логики и не должен смешиваться с основной поисковой семантикой.</w:t>
       </w:r>
     </w:p>
     <w:p>
@@ -3355,7 +3370,7 @@
         <w:pStyle w:val="FirstParagraph"/>
       </w:pPr>
       <w:r>
-        <w:t xml:space="preserve">Колонка «Частотность кластера» в исходном семядре у «Главной» стоит 865 997. Разбирался, откуда цифра: сложил все базовые частоты строк группы — получилось 841 749 по уникальным фразам плюс 24 248 по дублям (раздел 2), в сумме ровно 865 997. То есть это именно арифметическая сумма, а не потолок кластера.</w:t>
+        <w:t xml:space="preserve">Колонка «Частотность кластера» в исходном семядре у «Главной» стоит 865 997. Разбирался, откуда цифра: сложил все базовые частоты строк группы — получилось 841 749 по уникальным фразам плюс 24 248 по дублям (раздел 2), в сумме ровно 865 997. То есть для «Главной» это именно арифметическая сумма строк, а не оценка ёмкости кластера.</w:t>
       </w:r>
     </w:p>
     <w:p>
@@ -3363,7 +3378,7 @@
         <w:pStyle w:val="BodyText"/>
       </w:pPr>
       <w:r>
-        <w:t xml:space="preserve">Сумма даёт завышенную оценку, потому что подзапросы многократно входят в базовую корня. Если ориентироваться на неё при планировании показов, прогноз получится в разы выше реального. Адекватная оценка потолка — базовая частотность корневого запроса группы.</w:t>
+        <w:t xml:space="preserve">Такая сумма может давать завышенную оценку, потому что подзапросы многократно входят в базовую корня. Если ориентироваться на неё при планировании показов, прогноз может получиться в разы выше реалистичного. Базовая частотность корневого запроса — не идеальный потолок, но хороший контрольный ориентир масштаба кластера.</w:t>
       </w:r>
     </w:p>
     <w:p>
@@ -3786,7 +3801,7 @@
         <w:t xml:space="preserve"> </w:t>
       </w:r>
       <w:r>
-        <w:t xml:space="preserve">×7.0. Для относительных весов они ещё могут быть полезны, но для прогноза показов по кластеру — уже нет. У групп с отношением &lt;1 (</w:t>
+        <w:t xml:space="preserve">×7.0. Для относительных весов они ещё могут быть полезны, но для прогноза показов по кластеру — рискованны. У групп с отношением &lt;1 (</w:t>
       </w:r>
       <w:r>
         <w:rPr>
@@ -3822,7 +3837,7 @@
         <w:t xml:space="preserve"> </w:t>
       </w:r>
       <w:r>
-        <w:t xml:space="preserve">и подобных) сумма семядра, наоборот, преуменьшает потолок — фразы в группе покрывают узкую нишу, а корневой запрос шире.</w:t>
+        <w:t xml:space="preserve">и подобных) сумма семядра, наоборот, ниже корневого запроса — фразы в группе покрывают узкую нишу, а корень шире.</w:t>
       </w:r>
     </w:p>
     <w:p>
@@ -4315,7 +4330,22 @@
         <w:t xml:space="preserve"> </w:t>
       </w:r>
       <w:r>
-        <w:t xml:space="preserve">(0 → 1 390). В Директе</w:t>
+        <w:t xml:space="preserve">(0 → 1 390). Если</w:t>
+      </w:r>
+      <w:r>
+        <w:t xml:space="preserve"> </w:t>
+      </w:r>
+      <w:r>
+        <w:rPr>
+          <w:rStyle w:val="VerbatimChar"/>
+        </w:rPr>
+        <w:t xml:space="preserve">!W</w:t>
+      </w:r>
+      <w:r>
+        <w:t xml:space="preserve"> </w:t>
+      </w:r>
+      <w:r>
+        <w:t xml:space="preserve">используется для ставок, отбора ключей или медиаплана,</w:t>
       </w:r>
       <w:r>
         <w:t xml:space="preserve"> </w:t>
@@ -4330,7 +4360,7 @@
         <w:t xml:space="preserve"> </w:t>
       </w:r>
       <w:r>
-        <w:t xml:space="preserve">превращается в заниженную ставку и недобор показов по самым горячим ключам. Скорее всего, проблема в источнике: стоит уточнить, каким оператором сейчас снимается колонка, и при перевыгрузке использовать Wordstat API с оператором</w:t>
+        <w:t xml:space="preserve">превращается в риск недооценки горячих ключей. Скорее всего, проблема в источнике: стоит уточнить, каким оператором сейчас снимается колонка, и при перевыгрузке использовать Wordstat API с оператором</w:t>
       </w:r>
       <w:r>
         <w:t xml:space="preserve"> </w:t>
@@ -4909,7 +4939,7 @@
         <w:pStyle w:val="BodyText"/>
       </w:pPr>
       <w:r>
-        <w:t xml:space="preserve">Что нужно сделать — вычистить конфликтующие строки и оставить по одному значению на фразу. Первые три случая критичны: при импорте в Директ одна и та же фраза уедет в две разные кампании и получит две разные ставки. Особенно плохо с</w:t>
+        <w:t xml:space="preserve">Что нужно сделать — вычистить конфликтующие строки и оставить по одному значению на фразу. Первые три случая критичны для контроля качества: без дедупликации при импорте есть риск, что одна и та же фраза окажется в разных группах/кампаниях или будет оцениваться по разным ставочным данным. Особенно плохо с</w:t>
       </w:r>
       <w:r>
         <w:t xml:space="preserve"> </w:t>
@@ -4924,7 +4954,7 @@
         <w:t xml:space="preserve"> </w:t>
       </w:r>
       <w:r>
-        <w:t xml:space="preserve">— расхождение почти в тысячу раз, так что разные строки уйдут в разные ценовые лиги.</w:t>
+        <w:t xml:space="preserve">— расхождение почти в тысячу раз.</w:t>
       </w:r>
     </w:p>
     <w:p>
@@ -6093,7 +6123,7 @@
         <w:pStyle w:val="BodyText"/>
       </w:pPr>
       <w:r>
-        <w:t xml:space="preserve">Кластер замещающего спроса — самый тёплый сегмент по LTV, разбор в 4.2. Сейчас минусы</w:t>
+        <w:t xml:space="preserve">Кластер замещающего спроса потенциально ценный, разбор в 4.2. Минусы</w:t>
       </w:r>
       <w:r>
         <w:t xml:space="preserve"> </w:t>
@@ -6123,7 +6153,7 @@
         <w:t xml:space="preserve"> </w:t>
       </w:r>
       <w:r>
-        <w:t xml:space="preserve">его полностью отсекают.</w:t>
+        <w:t xml:space="preserve">могут его отсекать; это нужно проверить по фактическому уровню применения минусов.</w:t>
       </w:r>
     </w:p>
     <w:p>
@@ -7117,13 +7147,13 @@
       </w:r>
     </w:p>
     <w:bookmarkEnd w:id="33"/>
-    <w:bookmarkStart w:id="34" w:name="X5be872f5598ef33b8cf4195256ca037b2d5bd12"/>
+    <w:bookmarkStart w:id="34" w:name="Xd6eb6ba04585e62d53507f40a5a1fa25f437751"/>
     <w:p>
       <w:pPr>
         <w:pStyle w:val="Heading3"/>
       </w:pPr>
       <w:r>
-        <w:t xml:space="preserve">4.2. Замещающий спрос — самый тёплый сегмент по LTV</w:t>
+        <w:t xml:space="preserve">4.2. Замещающий спрос — потенциально ценный сегмент</w:t>
       </w:r>
     </w:p>
     <w:tbl>
@@ -7346,7 +7376,7 @@
         <w:pStyle w:val="BodyText"/>
       </w:pPr>
       <w:r>
-        <w:t xml:space="preserve">Суммарно по РФ — порядка 18 000 показов/мес. В Перми цифры скромнее (десятки, не сотни), но качество этого трафика высокое: клиент уже пользовался теплицей, она сломалась или устарела, и он пришёл за заменой с ясной потребностью. Сейчас этот кластер блокируется минусами</w:t>
+        <w:t xml:space="preserve">Суммарно по РФ — порядка 18 000 показов/мес. В Перми цифры скромнее (десятки, не сотни), но интент потенциально ценный: клиент уже пользовался теплицей, она сломалась или устарела, и он пришёл за заменой с ясной потребностью. Сейчас этот кластер может блокироваться минусами</w:t>
       </w:r>
       <w:r>
         <w:t xml:space="preserve"> </w:t>
@@ -7373,7 +7403,7 @@
         <w:t xml:space="preserve">демонтаж</w:t>
       </w:r>
       <w:r>
-        <w:t xml:space="preserve">.</w:t>
+        <w:t xml:space="preserve">; это нужно проверить в кабинете.</w:t>
       </w:r>
     </w:p>
     <w:bookmarkEnd w:id="34"/>
@@ -7577,7 +7607,7 @@
         <w:pStyle w:val="BodyText"/>
       </w:pPr>
       <w:r>
-        <w:t xml:space="preserve">Инфо-запросы — дешёвый трафик, сейчас полностью выпадает из плана. Запускать его имеет смысл отдельной кампанией с низкими ставками и целью на охват или прогрев. Мешать инфо-ключи с коммерческими в одной группе нельзя — CR разный, общие метрики размоются, а бюджет начнёт уходить в «как выбрать», а не в «купить».</w:t>
+        <w:t xml:space="preserve">Инфо-запросы — потенциально дешёвый верх воронки, сейчас они почти не представлены в плане. Запускать их имеет смысл только отдельной кампанией с низкими ставками и целью на охват или прогрев. Мешать инфо-ключи с коммерческими в одной группе рискованно: CR разный, общие метрики размоются, а бюджет может уходить в «как выбрать», а не в «купить».</w:t>
       </w:r>
     </w:p>
     <w:p>
@@ -8831,7 +8861,7 @@
         <w:pStyle w:val="Compact"/>
       </w:pPr>
       <w:r>
-        <w:t xml:space="preserve">Передать полную таблицу «фраза → посадочный URL» для всех групп объявлений. Без неё 277 фраз в Директ осмысленно не загрузить.</w:t>
+        <w:t xml:space="preserve">Передать полную таблицу «фраза → объявление/группа → финальный посадочный URL» для всех групп объявлений. Без неё невозможно проверить релевантность и фактическую маршрутизацию 277 фраз без URL в присланном семядре.</w:t>
       </w:r>
     </w:p>
     <w:p>
@@ -9404,7 +9434,7 @@
         <w:pStyle w:val="BodyText"/>
       </w:pPr>
       <w:r>
-        <w:t xml:space="preserve">В 2025 пик сезона пришёлся на апрель — 425 169 показов против 412 601 в марте. Это значит, что исторически апрель мог держаться чуть выше марта. В 2026 картина смешанная: март уже дал абсолютный максимум за два года (503 373), и возможно, пик сдвинулся на месяц раньше обычного. Даже если апрель удержит мартовский уровень, сейчас — середина пиковой зоны с горизонтом две-четыре недели, после чего начнётся спад к маю и провал к июню (в 2025 году май дал −15% к апрелю, июнь — ещё −56%). Каждая неделя задержки запуска — это упущенная пиковая выручка, которая вернётся только в феврале 2027 года.</w:t>
+        <w:t xml:space="preserve">В 2025 пик сезона пришёлся на апрель — 425 169 показов против 412 601 в марте. Это значит, что исторически апрель мог держаться чуть выше марта. В 2026 картина смешанная: март уже дал абсолютный максимум за два года (503 373), и возможно, пик сдвинулся на месяц раньше обычного. Даже если апрель удержит мартовский уровень, сейчас — середина пиковой зоны с горизонтом две-четыре недели, после чего начнётся спад к маю и провал к июню (в 2025 году май дал −15% к апрелю, июнь — ещё −56%). Каждая неделя задержки запуска повышает риск невосполнимой потери части пикового сезонного спроса.</w:t>
       </w:r>
     </w:p>
     <w:bookmarkEnd w:id="41"/>
@@ -9662,7 +9692,7 @@
         <w:pStyle w:val="FirstParagraph"/>
       </w:pPr>
       <w:r>
-        <w:t xml:space="preserve">Без этих правок запуск не имеет смысла — перечисляю по порядку и разделяю ответственность:</w:t>
+        <w:t xml:space="preserve">Без этих правок запуск будет плохо контролируемым — перечисляю по порядку и разделяю ответственность:</w:t>
       </w:r>
     </w:p>
     <w:p>

</xml_diff>

<commit_message>
vault backup: 2026-04-21 13:40:06
</commit_message>
<xml_diff>
--- a/dev/10 Projects/AZT/07_output/agency/AZT — Правки к плану MaximusMedia (финальная версия после полной сверки семядра) 2026-04-21.docx
+++ b/dev/10 Projects/AZT/07_output/agency/AZT — Правки к плану MaximusMedia (финальная версия после полной сверки семядра) 2026-04-21.docx
@@ -2629,7 +2629,7 @@
         <w:pStyle w:val="BodyText"/>
       </w:pPr>
       <w:r>
-        <w:t xml:space="preserve">Отдельная история — кластер СПК (сотовый поликарбонат, строки #381–417). Это SKU собственного поликарбоната AZT: Polygal ГОСТ, Томато, Практичный SMART, Колибри, КИВИ. Из 37 фраз у 22 и базовая, и</w:t>
+        <w:t xml:space="preserve">Отдельная история — кластер СПК (сотовый поликарбонат, строки #381–417). Это SKU собственного поликарбоната AZT: Polygal ГОСТ, Томато, Практичный SMART, Колибри, КИВИ. Из 37 фраз у 22 базовая Wordstat-частотность равна нулю; по</w:t>
       </w:r>
       <w:r>
         <w:t xml:space="preserve"> </w:t>
@@ -2641,19 +2641,7 @@
         <w:t xml:space="preserve">!</w:t>
       </w:r>
       <w:r>
-        <w:t xml:space="preserve">-частотность равны нулю, то есть прямого Wordstat-спроса по ним не видно. В исходном семядре при этом стоят значения 5–35. Оставшиеся 15 фраз показывают</w:t>
-      </w:r>
-      <w:r>
-        <w:t xml:space="preserve"> </w:t>
-      </w:r>
-      <w:r>
-        <w:rPr>
-          <w:rStyle w:val="VerbatimChar"/>
-        </w:rPr>
-        <w:t xml:space="preserve">!</w:t>
-      </w:r>
-      <w:r>
-        <w:t xml:space="preserve">-частотность 1–50 — для активной поисковой рекламы это слабая основа. В нынешнем виде кластер можно оставлять только как отдельную низкобюджетную/товарную гипотезу, но не как значимый блок performance-семантики.</w:t>
+        <w:t xml:space="preserve">-частотности тоже 22 нулевые фразы, но это не полностью один и тот же набор. В исходном семядре при этом стоят значения 5–35. Оставшиеся фразы показывают низкий прямой спрос — для активной поисковой рекламы это слабая основа. В нынешнем виде кластер можно оставлять только как отдельную низкобюджетную/товарную гипотезу, но не как значимый блок performance-семантики.</w:t>
       </w:r>
     </w:p>
     <w:bookmarkEnd w:id="21"/>
@@ -3628,6 +3616,65 @@
             </w:pPr>
             <w:r>
               <w:t xml:space="preserve">×54</w:t>
+            </w:r>
+          </w:p>
+        </w:tc>
+      </w:tr>
+      <w:tr>
+        <w:tc>
+          <w:tcPr/>
+          <w:p>
+            <w:pPr>
+              <w:pStyle w:val="Compact"/>
+              <w:jc w:val="left"/>
+            </w:pPr>
+            <w:r>
+              <w:rPr>
+                <w:rStyle w:val="VerbatimChar"/>
+              </w:rPr>
+              <w:t xml:space="preserve">парник ласточка</w:t>
+            </w:r>
+            <w:r>
+              <w:t xml:space="preserve"> </w:t>
+            </w:r>
+            <w:r>
+              <w:t xml:space="preserve">(1 фраза)</w:t>
+            </w:r>
+          </w:p>
+        </w:tc>
+        <w:tc>
+          <w:tcPr/>
+          <w:p>
+            <w:pPr>
+              <w:pStyle w:val="Compact"/>
+              <w:jc w:val="right"/>
+            </w:pPr>
+            <w:r>
+              <w:t xml:space="preserve">136</w:t>
+            </w:r>
+          </w:p>
+        </w:tc>
+        <w:tc>
+          <w:tcPr/>
+          <w:p>
+            <w:pPr>
+              <w:pStyle w:val="Compact"/>
+              <w:jc w:val="right"/>
+            </w:pPr>
+            <w:r>
+              <w:t xml:space="preserve">6</w:t>
+            </w:r>
+          </w:p>
+        </w:tc>
+        <w:tc>
+          <w:tcPr/>
+          <w:p>
+            <w:pPr>
+              <w:pStyle w:val="Compact"/>
+              <w:jc w:val="right"/>
+            </w:pPr>
+            <w:r>
+              <w:t xml:space="preserve">×23</w:t>
             </w:r>
           </w:p>
         </w:tc>
@@ -10416,7 +10463,7 @@
         <w:t xml:space="preserve">!</w:t>
       </w:r>
       <w:r>
-        <w:t xml:space="preserve">-частотностью = 0 (37 «мёртвых ключей» — по ним в Wordstat запросов нет вообще), только 4% близки к факту.</w:t>
+        <w:t xml:space="preserve">-частотностью = 0 (37 фраз без показов в фиксированной словоформе), только 4% близки к факту.</w:t>
       </w:r>
     </w:p>
     <w:p>
@@ -10452,7 +10499,7 @@
         <w:pStyle w:val="Compact"/>
       </w:pPr>
       <w:r>
-        <w:t xml:space="preserve">Кластер СПК #381–417 самый проблемный: из 37 фраз 22 не имеют реального спроса (60%).</w:t>
+        <w:t xml:space="preserve">Кластер СПК #381–417 самый проблемный: у 22 из 37 фраз базовая Wordstat-частотность равна нулю (60%).</w:t>
       </w:r>
     </w:p>
     <w:p>
@@ -10788,13 +10835,13 @@
                 <w:bCs/>
                 <w:b/>
               </w:rPr>
-              <w:t xml:space="preserve">9</w:t>
+              <w:t xml:space="preserve">10</w:t>
             </w:r>
             <w:r>
               <w:t xml:space="preserve"> </w:t>
             </w:r>
             <w:r>
-              <w:t xml:space="preserve">(7/2)</w:t>
+              <w:t xml:space="preserve">(7/3)</w:t>
             </w:r>
           </w:p>
         </w:tc>
@@ -10818,7 +10865,7 @@
               <w:jc w:val="right"/>
             </w:pPr>
             <w:r>
-              <w:t xml:space="preserve">1</w:t>
+              <w:t xml:space="preserve">0</w:t>
             </w:r>
           </w:p>
         </w:tc>
@@ -10904,41 +10951,41 @@
               <w:jc w:val="left"/>
             </w:pPr>
             <w:r>
-              <w:t xml:space="preserve">9 (8/1)</w:t>
-            </w:r>
-          </w:p>
-        </w:tc>
-        <w:tc>
-          <w:tcPr/>
-          <w:p>
-            <w:pPr>
-              <w:pStyle w:val="Compact"/>
-              <w:jc w:val="left"/>
-            </w:pPr>
-            <w:r>
               <w:rPr>
                 <w:bCs/>
                 <w:b/>
               </w:rPr>
-              <w:t xml:space="preserve">9</w:t>
+              <w:t xml:space="preserve">12</w:t>
             </w:r>
             <w:r>
               <w:t xml:space="preserve"> </w:t>
             </w:r>
             <w:r>
-              <w:t xml:space="preserve">(9/0)</w:t>
-            </w:r>
-          </w:p>
-        </w:tc>
-        <w:tc>
-          <w:tcPr/>
-          <w:p>
-            <w:pPr>
-              <w:pStyle w:val="Compact"/>
-              <w:jc w:val="right"/>
-            </w:pPr>
-            <w:r>
-              <w:t xml:space="preserve">3</w:t>
+              <w:t xml:space="preserve">(8/4)</w:t>
+            </w:r>
+          </w:p>
+        </w:tc>
+        <w:tc>
+          <w:tcPr/>
+          <w:p>
+            <w:pPr>
+              <w:pStyle w:val="Compact"/>
+              <w:jc w:val="left"/>
+            </w:pPr>
+            <w:r>
+              <w:t xml:space="preserve">9 (9/0)</w:t>
+            </w:r>
+          </w:p>
+        </w:tc>
+        <w:tc>
+          <w:tcPr/>
+          <w:p>
+            <w:pPr>
+              <w:pStyle w:val="Compact"/>
+              <w:jc w:val="right"/>
+            </w:pPr>
+            <w:r>
+              <w:t xml:space="preserve">0</w:t>
             </w:r>
           </w:p>
         </w:tc>
@@ -11028,13 +11075,13 @@
                 <w:bCs/>
                 <w:b/>
               </w:rPr>
-              <w:t xml:space="preserve">14</w:t>
+              <w:t xml:space="preserve">15</w:t>
             </w:r>
             <w:r>
               <w:t xml:space="preserve"> </w:t>
             </w:r>
             <w:r>
-              <w:t xml:space="preserve">(13/1)</w:t>
+              <w:t xml:space="preserve">(13/2)</w:t>
             </w:r>
           </w:p>
         </w:tc>
@@ -11058,7 +11105,7 @@
               <w:jc w:val="right"/>
             </w:pPr>
             <w:r>
-              <w:t xml:space="preserve">3</w:t>
+              <w:t xml:space="preserve">2</w:t>
             </w:r>
           </w:p>
         </w:tc>

</xml_diff>